<commit_message>
feat: add Jobs, Profiles, and Search features
- Add Jobs API with ranked endpoint and on-demand analysis
- Add Profile Chat API for CV profile management
- Add Search Profiles UI with authentication support
- Add Jobs window with AI match scores and CV generation
- Add LinkedIn scraper with Selenium support
- Add job scorer with LLM-based analysis
- Add enricher for on-demand job analysis
- Add kill_all.bat utility script
- Update .gitignore for better exclusions
</commit_message>
<xml_diff>
--- a/layoutCV/layout.docx
+++ b/layoutCV/layout.docx
@@ -15,7 +15,7 @@
         <w:rPr>
           <w:rFonts w:ascii="Open Sans ExtraBold" w:hAnsi="Open Sans ExtraBold" w:cs="Open Sans ExtraBold"/>
         </w:rPr>
-        <w:t>Leonardo Valões Novaes Ribeiro</w:t>
+        <w:t>{{NOME}}</w:t>
       </w:r>
     </w:p>
     <w:bookmarkEnd w:id="0"/>
@@ -56,7 +56,7 @@
             <w14:bevel/>
           </w14:textOutline>
         </w:rPr>
-        <w:t>N</w:t>
+        <w:t>{{CARGO}}</w:t>
       </w:r>
       <w:r>
         <w:rPr>
@@ -74,7 +74,6 @@
             <w14:bevel/>
           </w14:textOutline>
         </w:rPr>
-        <w:t>ome cargo | Palavra Chave | Nome Cargo (diferente do outro)</w:t>
       </w:r>
     </w:p>
     <w:p>
@@ -91,21 +90,19 @@
           <w:color w:val="auto"/>
           <w:u w:color="666666"/>
         </w:rPr>
-        <w:t xml:space="preserve">Presidente Prudente – </w:t>
+        <w:t>{{CIDADE}} – {{ESTADO}}</w:t>
       </w:r>
       <w:r>
         <w:rPr>
           <w:color w:val="auto"/>
           <w:u w:val="single" w:color="666666"/>
         </w:rPr>
-        <w:t>São</w:t>
       </w:r>
       <w:r>
         <w:rPr>
           <w:color w:val="auto"/>
           <w:u w:color="666666"/>
         </w:rPr>
-        <w:t xml:space="preserve"> Paulo</w:t>
       </w:r>
     </w:p>
     <w:p>
@@ -122,7 +119,7 @@
           <w:color w:val="auto"/>
           <w:u w:color="666666"/>
         </w:rPr>
-        <w:t>leonvaloesnovaes@gmail.com</w:t>
+        <w:t>{{EMAIL}}</w:t>
       </w:r>
     </w:p>
     <w:p>
@@ -140,49 +137,43 @@
           <w:color w:val="auto"/>
           <w:lang w:val="it-IT"/>
         </w:rPr>
-        <w:t>Telefone</w:t>
+        <w:t>Telefone: {{TELEFONE}}</w:t>
       </w:r>
       <w:r>
         <w:rPr>
           <w:rFonts w:ascii="Nunito" w:hAnsi="Nunito"/>
           <w:lang w:val="it-IT"/>
         </w:rPr>
-        <w:t>:</w:t>
       </w:r>
       <w:r>
         <w:rPr>
           <w:rFonts w:ascii="Nunito" w:hAnsi="Nunito"/>
           <w:lang w:val="it-IT"/>
         </w:rPr>
-        <w:t xml:space="preserve"> </w:t>
       </w:r>
       <w:r>
         <w:rPr>
           <w:color w:val="auto"/>
           <w:u w:color="666666"/>
         </w:rPr>
-        <w:t>(</w:t>
       </w:r>
       <w:r>
         <w:rPr>
           <w:color w:val="auto"/>
           <w:u w:color="666666"/>
         </w:rPr>
-        <w:t>18</w:t>
       </w:r>
       <w:r>
         <w:rPr>
           <w:color w:val="auto"/>
           <w:u w:color="666666"/>
         </w:rPr>
-        <w:t xml:space="preserve">) </w:t>
       </w:r>
       <w:r>
         <w:rPr>
           <w:color w:val="auto"/>
           <w:u w:color="666666"/>
         </w:rPr>
-        <w:t>99745-0885</w:t>
       </w:r>
     </w:p>
     <w:p>
@@ -201,6 +192,9 @@
           <w:t>linkedin.com/leonardo-valoes-ribeiro</w:t>
         </w:r>
       </w:hyperlink>
+      <w:r>
+        <w:t>{{LINKEDIN}}</w:t>
+      </w:r>
     </w:p>
     <w:p>
       <w:pPr>
@@ -406,7 +400,7 @@
           <w:sz w:val="22"/>
           <w:szCs w:val="22"/>
         </w:rPr>
-        <w:t xml:space="preserve">Especialista em xxxxxcom mais de xxxxxx anos de experiência. </w:t>
+        <w:t>{{RESUMO}}</w:t>
       </w:r>
     </w:p>
     <w:p>
@@ -555,7 +549,7 @@
           <w:rFonts w:ascii="Nunito" w:hAnsi="Nunito"/>
           <w:lang w:val="pt-BR"/>
         </w:rPr>
-        <w:t>Requisitos das vagas</w:t>
+        <w:t>{{COMPETENCIAS}}</w:t>
       </w:r>
     </w:p>
     <w:p>

</xml_diff>